<commit_message>
Setup copies master templates; remove discovery-review
- discovery-setup copies 14 master files from a shared Drive folder (references/master-templates.yaml)
  instead of reading templates.json and rebuilding each Doc and Sheet; templates.json is the fallback
- README template lists 07 Prototype
- discovery-review removed: its counting belongs in code, not a skill

Co-Authored-By: Claude Opus 5.5 <noreply@anthropic.com>
Claude-Session: https://claude.ai/code/session_01JEt3XhtRwUHbEHNFmAvqPW
</commit_message>
<xml_diff>
--- a/templates-source/discovery-setup/readme.docx
+++ b/templates-source/discovery-setup/readme.docx
@@ -72,6 +72,14 @@
       </w:pPr>
       <w:r>
         <w:t>06 Requirements: requirements register, open questions, constraints</w:t>
+      </w:r>
+    </w:p>
+    <w:p>
+      <w:pPr>
+        <w:pStyle w:val="ListBullet"/>
+      </w:pPr>
+      <w:r>
+        <w:t>07 Prototype: wireframe versions and the screen spec for designers</w:t>
       </w:r>
     </w:p>
     <w:p>

</xml_diff>